<commit_message>
Respaldo La Salle: nombre comercial reemplazado por «app estándar de referencia»
Informes, prueba de La Salle y tabla comparativa (.docx). Autorizado por el
usuario («autorizado para la limpieza de la rama»). La tesis en PDF es el
documento fuente y no se modifica.

Co-Authored-By: Claude Opus 5.5 <noreply@anthropic.com>
Claude-Session: https://claude.ai/code/session_01J652KVwAx7nCc91Dn42CnM
</commit_message>
<xml_diff>
--- a/references/tabla-comparativa-lasalle-app.docx
+++ b/references/tabla-comparativa-lasalle-app.docx
@@ -8,7 +8,7 @@
           <w:b/>
           <w:sz w:val="32"/>
         </w:rPr>
-        <w:t xml:space="preserve">Tabla comparativa (v2) — Tesis La Salle / PV·SOL vs APP BIPV</w:t>
+        <w:t xml:space="preserve">Tabla comparativa (v2) — Tesis La Salle (app estándar de referencia) vs APP BIPV</w:t>
       </w:r>
     </w:p>
     <w:p>
@@ -59,7 +59,7 @@
                 <w:b/>
                 <w:sz w:val="18"/>
               </w:rPr>
-              <w:t xml:space="preserve">Tesis / PV·SOL</w:t>
+              <w:t xml:space="preserve">Tesis / app estándar de referencia</w:t>
             </w:r>
           </w:p>
         </w:tc>
@@ -534,7 +534,7 @@
               <w:rPr>
                 <w:sz w:val="18"/>
               </w:rPr>
-              <w:t xml:space="preserve">PV·SOL incluye 3.7%/año</w:t>
+              <w:t xml:space="preserve">La app estándar de referencia incluye 3.7%/año</w:t>
             </w:r>
           </w:p>
         </w:tc>
@@ -601,7 +601,7 @@
               <w:rPr>
                 <w:sz w:val="18"/>
               </w:rPr>
-              <w:t xml:space="preserve">PV·SOL incluye 1.0%/año</w:t>
+              <w:t xml:space="preserve">La app estándar de referencia incluye 1.0%/año</w:t>
             </w:r>
           </w:p>
         </w:tc>
@@ -707,7 +707,7 @@
               <w:rPr>
                 <w:sz w:val="18"/>
               </w:rPr>
-              <w:t xml:space="preserve">No comparable: TMY sintético clear-sky vs. base PV·SOL</w:t>
+              <w:t xml:space="preserve">No comparable: TMY sintético clear-sky vs. base de la app estándar de referencia</w:t>
             </w:r>
           </w:p>
         </w:tc>
@@ -1539,7 +1539,7 @@
               <w:rPr>
                 <w:sz w:val="18"/>
               </w:rPr>
-              <w:t xml:space="preserve">No declarada por PV·SOL</w:t>
+              <w:t xml:space="preserve">No declarada por la app estándar de referencia</w:t>
             </w:r>
           </w:p>
         </w:tc>
@@ -1656,7 +1656,7 @@
         <w:rPr>
           <w:sz w:val="22"/>
         </w:rPr>
-        <w:t xml:space="preserve">Resumen (segunda ronda, offline): la APP reproduce exactamente la geometria, el panel y el orden fisico de las fachadas. Los valores absolutos de POA y energia no son comparables porque el TMY sintetico de cielo despejado sobreestima el recurso solar mucho mas que la base meteorologica de PV.SOL, y porque la APP no modela sombra real, cableado, mismatch ni clipping del inversor. Al normalizar por recurso solar, el residual queda en +4.88% (referencia) y +6.99% (fachadas) -- estable frente a la corrida anterior con PVGIS real (+6.0%/+6.8%), lo que respalda que la brecha proviene de perdidas de PV.SOL no modeladas, no de un error del motor fisico. No se alcanza paridad numerica exacta: faltan la mascara angular de sombra, el reparto real de los 148 modulos por fachada y la base meteorologica de PV.SOL.</w:t>
+        <w:t xml:space="preserve">Resumen (segunda ronda, offline): la APP reproduce exactamente la geometria, el panel y el orden fisico de las fachadas. Los valores absolutos de POA y energia no son comparables porque el TMY sintetico de cielo despejado sobreestima el recurso solar mucho mas que la base meteorologica de la app estándar de referencia, y porque la APP no modela sombra real, cableado, mismatch ni clipping del inversor. Al normalizar por recurso solar, el residual queda en +4.88% (referencia) y +6.99% (fachadas) -- estable frente a la corrida anterior con PVGIS real (+6.0%/+6.8%), lo que respalda que la brecha proviene de perdidas de la app estándar de referencia no modeladas, no de un error del motor fisico. No se alcanza paridad numerica exacta: faltan la mascara angular de sombra, el reparto real de los 148 modulos por fachada y la base meteorologica de la app estándar de referencia.</w:t>
       </w:r>
     </w:p>
     <w:sectPr>

</xml_diff>